<commit_message>
docs(report): point Appendix B.10 at docs/evidence/human_eval/
- Adds an explicit pointer in Appendix B.10 to the single discoverable
  evidence pack at docs/evidence/human_eval/ (README.md,
  participant_info.md, consent_text.md, rubric.md,
  anonymised_scores.csv, summary_stats.csv, thematic_summary.md).
- Adds an Anonymisation Statement at the top of B.10 making the
  collection-time anonymisation policy explicit (P1-P6 + role tag, no
  PII ever stored, themes coded post-hoc, no verbatim quotes).
- Adds a docs/evidence/human_eval/README.md that documents the
  per-participant aggregate granularity of anonymised_scores.csv and
  cross-references Limitation L5 (per-(participant, query) rows were
  not retained at collection time).
- PDF rebuilt: pagemap converged in two passes, 61 pages, body still
  30 pages, no figure displacement.
</commit_message>
<xml_diff>
--- a/docs/report/Final_Report_Draft_template.docx
+++ b/docs/report/Final_Report_Draft_template.docx
@@ -31559,7 +31559,169 @@
         <w:jc w:val="both"/>
       </w:pPr>
       <w:r>
-        <w:t xml:space="preserve">This appendix archives the materials and anonymised results for the independent reviewer evaluation reported in Section 4.10. The evaluation was conducted between 14 and 18 April 2026 with six peer participants (three Final-Year BSc Computer Science students and three MSc Computer Science students) recruited voluntarily from the University of Leeds School of Computing, outside the project’s supervisory chain.</w:t>
+        <w:t xml:space="preserve">This appendix archives the materials and anonymised results for the independent reviewer evaluation reported in Section 4.10. The evaluation was conducted between 14 and 18 April 2026 with six peer participants (three Final-Year BSc Computer Science students and three MSc Computer Science students) recruited voluntarily from the University of Leeds School of Computing, outside the project’s supervisory chain. A single discoverable copy of the materials and results lives at</w:t>
+      </w:r>
+      <w:r>
+        <w:t xml:space="preserve"> </w:t>
+      </w:r>
+      <w:r>
+        <w:rPr>
+          <w:rStyle w:val="VerbatimChar"/>
+        </w:rPr>
+        <w:t xml:space="preserve">docs/evidence/human_eval/</w:t>
+      </w:r>
+      <w:r>
+        <w:t xml:space="preserve"> </w:t>
+      </w:r>
+      <w:r>
+        <w:t xml:space="preserve">(</w:t>
+      </w:r>
+      <w:r>
+        <w:rPr>
+          <w:rStyle w:val="VerbatimChar"/>
+        </w:rPr>
+        <w:t xml:space="preserve">README.md</w:t>
+      </w:r>
+      <w:r>
+        <w:t xml:space="preserve">,</w:t>
+      </w:r>
+      <w:r>
+        <w:t xml:space="preserve"> </w:t>
+      </w:r>
+      <w:r>
+        <w:rPr>
+          <w:rStyle w:val="VerbatimChar"/>
+        </w:rPr>
+        <w:t xml:space="preserve">participant_info.md</w:t>
+      </w:r>
+      <w:r>
+        <w:t xml:space="preserve">,</w:t>
+      </w:r>
+      <w:r>
+        <w:t xml:space="preserve"> </w:t>
+      </w:r>
+      <w:r>
+        <w:rPr>
+          <w:rStyle w:val="VerbatimChar"/>
+        </w:rPr>
+        <w:t xml:space="preserve">consent_text.md</w:t>
+      </w:r>
+      <w:r>
+        <w:t xml:space="preserve">,</w:t>
+      </w:r>
+      <w:r>
+        <w:t xml:space="preserve"> </w:t>
+      </w:r>
+      <w:r>
+        <w:rPr>
+          <w:rStyle w:val="VerbatimChar"/>
+        </w:rPr>
+        <w:t xml:space="preserve">rubric.md</w:t>
+      </w:r>
+      <w:r>
+        <w:t xml:space="preserve">,</w:t>
+      </w:r>
+      <w:r>
+        <w:t xml:space="preserve"> </w:t>
+      </w:r>
+      <w:r>
+        <w:rPr>
+          <w:rStyle w:val="VerbatimChar"/>
+        </w:rPr>
+        <w:t xml:space="preserve">anonymised_scores.csv</w:t>
+      </w:r>
+      <w:r>
+        <w:t xml:space="preserve">,</w:t>
+      </w:r>
+      <w:r>
+        <w:t xml:space="preserve"> </w:t>
+      </w:r>
+      <w:r>
+        <w:rPr>
+          <w:rStyle w:val="VerbatimChar"/>
+        </w:rPr>
+        <w:t xml:space="preserve">summary_stats.csv</w:t>
+      </w:r>
+      <w:r>
+        <w:t xml:space="preserve">,</w:t>
+      </w:r>
+      <w:r>
+        <w:t xml:space="preserve"> </w:t>
+      </w:r>
+      <w:r>
+        <w:rPr>
+          <w:rStyle w:val="VerbatimChar"/>
+        </w:rPr>
+        <w:t xml:space="preserve">thematic_summary.md</w:t>
+      </w:r>
+      <w:r>
+        <w:t xml:space="preserve">); that folder is the entry point an examiner is expected to use.</w:t>
+      </w:r>
+    </w:p>
+    <w:p>
+      <w:pPr>
+        <w:jc w:val="both"/>
+      </w:pPr>
+      <w:r>
+        <w:rPr>
+          <w:b/>
+          <w:bCs/>
+        </w:rPr>
+        <w:t xml:space="preserve">Anonymisation statement.</w:t>
+      </w:r>
+      <w:r>
+        <w:t xml:space="preserve"> </w:t>
+      </w:r>
+      <w:r>
+        <w:t xml:space="preserve">Anonymisation was applied at collection time, not retrospectively. Participants were assigned the labels</w:t>
+      </w:r>
+      <w:r>
+        <w:t xml:space="preserve"> </w:t>
+      </w:r>
+      <w:r>
+        <w:rPr>
+          <w:rStyle w:val="VerbatimChar"/>
+        </w:rPr>
+        <w:t xml:space="preserve">P1</w:t>
+      </w:r>
+      <w:r>
+        <w:t xml:space="preserve">-</w:t>
+      </w:r>
+      <w:r>
+        <w:rPr>
+          <w:rStyle w:val="VerbatimChar"/>
+        </w:rPr>
+        <w:t xml:space="preserve">P6</w:t>
+      </w:r>
+      <w:r>
+        <w:t xml:space="preserve"> </w:t>
+      </w:r>
+      <w:r>
+        <w:t xml:space="preserve">and a coarse role tag (</w:t>
+      </w:r>
+      <w:r>
+        <w:rPr>
+          <w:rStyle w:val="VerbatimChar"/>
+        </w:rPr>
+        <w:t xml:space="preserve">BSc CS</w:t>
+      </w:r>
+      <w:r>
+        <w:t xml:space="preserve"> </w:t>
+      </w:r>
+      <w:r>
+        <w:t xml:space="preserve">or</w:t>
+      </w:r>
+      <w:r>
+        <w:t xml:space="preserve"> </w:t>
+      </w:r>
+      <w:r>
+        <w:rPr>
+          <w:rStyle w:val="VerbatimChar"/>
+        </w:rPr>
+        <w:t xml:space="preserve">MSc CS</w:t>
+      </w:r>
+      <w:r>
+        <w:t xml:space="preserve">) before any data was stored. No name, email, course code, or other personal identifier was ever written to the dataset. Optional free-text comments were coded into themes after the evaluation closed and are not retained verbatim.</w:t>
       </w:r>
     </w:p>
     <w:p>

</xml_diff>